<commit_message>
Use the new book title and add the Excel templates
Rename the book to 30 Claude Workflows for Small Business Owners on
every page and in the bonus files, redraw the CSS cover in the new
layout, and add the three Excel templates rebuilt from the original
script (publisher renamed to Monarch Lane Press, no formula errors).

Co-Authored-By: Claude Opus 5.5 <noreply@anthropic.com>
Claude-Session: https://claude.ai/code/session_01MqTghQ37NnUC6uPAhC4kwx
</commit_message>
<xml_diff>
--- a/claude/files/20-more-briefs.docx
+++ b/claude/files/20-more-briefs.docx
@@ -13,7 +13,7 @@
           <w:sz w:val="18"/>
           <w:szCs w:val="18"/>
         </w:rPr>
-        <w:t xml:space="preserve">Claude for Small Business Owners: bonus files</w:t>
+        <w:t xml:space="preserve">30 Claude Workflows for Small Business Owners: bonus files</w:t>
       </w:r>
     </w:p>
     <w:p>
@@ -3104,7 +3104,7 @@
           <w:sz w:val="16"/>
           <w:szCs w:val="16"/>
         </w:rPr>
-        <w:t xml:space="preserve">From Claude for Small Business Owners by Adam Jabeur, published by Monarch Lane Press. Bonus files and the update log: monarchlanepress.com/claude. This book and its bonus files are independent and are not affiliated with, sponsored by or endorsed by Anthropic. Claude is a trademark of Anthropic, PBC.</w:t>
+        <w:t xml:space="preserve">From 30 Claude Workflows for Small Business Owners by Adam Jabeur, published by Monarch Lane Press. Bonus files and the update log: monarchlanepress.com/claude. This book and its bonus files are independent and are not affiliated with, sponsored by or endorsed by Anthropic. Claude is a trademark of Anthropic, PBC.</w:t>
       </w:r>
     </w:p>
     <w:sectPr>

</xml_diff>